<commit_message>
Add strict-subset sensitivity (S19) and per-class referral breakdown (S20)
Recompute absolute and referral results on test and validation images whose
video-linked group lies entirely in the evaluated subset; add per-class top-2
and error among decided images; extend the number checker.

Co-Authored-By: Claude Sonnet 5.5 <noreply@anthropic.com>
Claude-Session: https://claude.ai/code/session_01Xasp24HTiY6TEJCawpLmok
</commit_message>
<xml_diff>
--- a/paper/supplementary.docx
+++ b/paper/supplementary.docx
@@ -17206,6 +17206,2801 @@
       </w:tr>
     </w:tbl>
     <w:bookmarkEnd w:id="44"/>
+    <w:bookmarkStart w:id="45" w:name="Xd36d6ae493914c41abb4569358dbf10ed176bc5"/>
+    <w:p>
+      <w:pPr>
+        <w:pStyle w:val="Heading2"/>
+      </w:pPr>
+      <w:r>
+        <w:t xml:space="preserve">Table S19. Absolute and referral results on the strict subset (test and validation images whose video-linked group lies entirely inside the evaluated subset)</w:t>
+      </w:r>
+    </w:p>
+    <w:p>
+      <w:pPr>
+        <w:pStyle w:val="FirstParagraph"/>
+      </w:pPr>
+      <w:r>
+        <w:t xml:space="preserve">Mean test images per run 87.0 (primary scoring: 121.8); mean validation images per run 34.2 (primary scoring: 34.8). This subset contains 1.4 %</w:t>
+      </w:r>
+      <w:r>
+        <w:t xml:space="preserve"> </w:t>
+      </w:r>
+      <w:r>
+        <w:rPr>
+          <w:iCs/>
+          <w:i/>
+        </w:rPr>
+        <w:t xml:space="preserve">Phomopsis</w:t>
+      </w:r>
+      <w:r>
+        <w:t xml:space="preserve"> </w:t>
+      </w:r>
+      <w:r>
+        <w:t xml:space="preserve">images against 19.3 % in the primary scoring, so it is cleaner but easier and is not a corrected estimate. Means over 40 runs; decided = images whose confidence reached the threshold chosen on the validation images.</w:t>
+      </w:r>
+    </w:p>
+    <w:tbl>
+      <w:tblPr>
+        <w:tblStyle w:val="Table"/>
+        <w:tblW w:type="pct" w:w="5000"/>
+        <w:tblLook w:firstRow="1" w:lastRow="0" w:firstColumn="0" w:lastColumn="0" w:noHBand="0" w:noVBand="0" w:val="0020"/>
+        <w:jc w:val="start"/>
+      </w:tblPr>
+      <w:tblGrid>
+        <w:gridCol w:w="1377"/>
+        <w:gridCol w:w="550"/>
+        <w:gridCol w:w="550"/>
+        <w:gridCol w:w="413"/>
+        <w:gridCol w:w="482"/>
+        <w:gridCol w:w="688"/>
+        <w:gridCol w:w="688"/>
+        <w:gridCol w:w="688"/>
+        <w:gridCol w:w="550"/>
+        <w:gridCol w:w="688"/>
+        <w:gridCol w:w="688"/>
+        <w:gridCol w:w="550"/>
+      </w:tblGrid>
+      <w:tr>
+        <w:trPr>
+          <w:tblHeader w:val="true"/>
+        </w:trPr>
+        <w:tc>
+          <w:tcPr/>
+          <w:p>
+            <w:pPr>
+              <w:pStyle w:val="Compact"/>
+              <w:jc w:val="left"/>
+            </w:pPr>
+            <w:r>
+              <w:t xml:space="preserve">Backbone</w:t>
+            </w:r>
+          </w:p>
+        </w:tc>
+        <w:tc>
+          <w:tcPr/>
+          <w:p>
+            <w:pPr>
+              <w:pStyle w:val="Compact"/>
+              <w:jc w:val="left"/>
+            </w:pPr>
+            <w:r>
+              <w:t xml:space="preserve">Macro F1 (%)</w:t>
+            </w:r>
+          </w:p>
+        </w:tc>
+        <w:tc>
+          <w:tcPr/>
+          <w:p>
+            <w:pPr>
+              <w:pStyle w:val="Compact"/>
+              <w:jc w:val="left"/>
+            </w:pPr>
+            <w:r>
+              <w:t xml:space="preserve">Accuracy (%)</w:t>
+            </w:r>
+          </w:p>
+        </w:tc>
+        <w:tc>
+          <w:tcPr/>
+          <w:p>
+            <w:pPr>
+              <w:pStyle w:val="Compact"/>
+              <w:jc w:val="left"/>
+            </w:pPr>
+            <w:r>
+              <w:t xml:space="preserve">AURC</w:t>
+            </w:r>
+          </w:p>
+        </w:tc>
+        <w:tc>
+          <w:tcPr/>
+          <w:p>
+            <w:pPr>
+              <w:pStyle w:val="Compact"/>
+              <w:jc w:val="left"/>
+            </w:pPr>
+            <w:r>
+              <w:t xml:space="preserve">Top-2 (%)</w:t>
+            </w:r>
+          </w:p>
+        </w:tc>
+        <w:tc>
+          <w:tcPr/>
+          <w:p>
+            <w:pPr>
+              <w:pStyle w:val="Compact"/>
+              <w:jc w:val="left"/>
+            </w:pPr>
+            <w:r>
+              <w:t xml:space="preserve">Accuracy at 70 % coverage (%)</w:t>
+            </w:r>
+          </w:p>
+        </w:tc>
+        <w:tc>
+          <w:tcPr/>
+          <w:p>
+            <w:pPr>
+              <w:pStyle w:val="Compact"/>
+              <w:jc w:val="left"/>
+            </w:pPr>
+            <w:r>
+              <w:t xml:space="preserve">Decided, 90 % target (%)</w:t>
+            </w:r>
+          </w:p>
+        </w:tc>
+        <w:tc>
+          <w:tcPr/>
+          <w:p>
+            <w:pPr>
+              <w:pStyle w:val="Compact"/>
+              <w:jc w:val="left"/>
+            </w:pPr>
+            <w:r>
+              <w:t xml:space="preserve">Accuracy on decided (%)</w:t>
+            </w:r>
+          </w:p>
+        </w:tc>
+        <w:tc>
+          <w:tcPr/>
+          <w:p>
+            <w:pPr>
+              <w:pStyle w:val="Compact"/>
+              <w:jc w:val="left"/>
+            </w:pPr>
+            <w:r>
+              <w:t xml:space="preserve">Runs below 90 %</w:t>
+            </w:r>
+          </w:p>
+        </w:tc>
+        <w:tc>
+          <w:tcPr/>
+          <w:p>
+            <w:pPr>
+              <w:pStyle w:val="Compact"/>
+              <w:jc w:val="left"/>
+            </w:pPr>
+            <w:r>
+              <w:t xml:space="preserve">Decided, 95 % target (%)</w:t>
+            </w:r>
+          </w:p>
+        </w:tc>
+        <w:tc>
+          <w:tcPr/>
+          <w:p>
+            <w:pPr>
+              <w:pStyle w:val="Compact"/>
+              <w:jc w:val="left"/>
+            </w:pPr>
+            <w:r>
+              <w:t xml:space="preserve">Accuracy on decided (%)</w:t>
+            </w:r>
+          </w:p>
+        </w:tc>
+        <w:tc>
+          <w:tcPr/>
+          <w:p>
+            <w:pPr>
+              <w:pStyle w:val="Compact"/>
+              <w:jc w:val="left"/>
+            </w:pPr>
+            <w:r>
+              <w:t xml:space="preserve">Runs below 95 %</w:t>
+            </w:r>
+          </w:p>
+        </w:tc>
+      </w:tr>
+      <w:tr>
+        <w:tc>
+          <w:tcPr/>
+          <w:p>
+            <w:pPr>
+              <w:pStyle w:val="Compact"/>
+              <w:jc w:val="left"/>
+            </w:pPr>
+            <w:r>
+              <w:t xml:space="preserve">EfficientNet-B0</w:t>
+            </w:r>
+          </w:p>
+        </w:tc>
+        <w:tc>
+          <w:tcPr/>
+          <w:p>
+            <w:pPr>
+              <w:pStyle w:val="Compact"/>
+              <w:jc w:val="left"/>
+            </w:pPr>
+            <w:r>
+              <w:t xml:space="preserve">67.0</w:t>
+            </w:r>
+          </w:p>
+        </w:tc>
+        <w:tc>
+          <w:tcPr/>
+          <w:p>
+            <w:pPr>
+              <w:pStyle w:val="Compact"/>
+              <w:jc w:val="left"/>
+            </w:pPr>
+            <w:r>
+              <w:t xml:space="preserve">77.0</w:t>
+            </w:r>
+          </w:p>
+        </w:tc>
+        <w:tc>
+          <w:tcPr/>
+          <w:p>
+            <w:pPr>
+              <w:pStyle w:val="Compact"/>
+              <w:jc w:val="left"/>
+            </w:pPr>
+            <w:r>
+              <w:t xml:space="preserve">10.57</w:t>
+            </w:r>
+          </w:p>
+        </w:tc>
+        <w:tc>
+          <w:tcPr/>
+          <w:p>
+            <w:pPr>
+              <w:pStyle w:val="Compact"/>
+              <w:jc w:val="left"/>
+            </w:pPr>
+            <w:r>
+              <w:t xml:space="preserve">95.5</w:t>
+            </w:r>
+          </w:p>
+        </w:tc>
+        <w:tc>
+          <w:tcPr/>
+          <w:p>
+            <w:pPr>
+              <w:pStyle w:val="Compact"/>
+              <w:jc w:val="left"/>
+            </w:pPr>
+            <w:r>
+              <w:t xml:space="preserve">84.9</w:t>
+            </w:r>
+          </w:p>
+        </w:tc>
+        <w:tc>
+          <w:tcPr/>
+          <w:p>
+            <w:pPr>
+              <w:pStyle w:val="Compact"/>
+              <w:jc w:val="left"/>
+            </w:pPr>
+            <w:r>
+              <w:t xml:space="preserve">69.3</w:t>
+            </w:r>
+          </w:p>
+        </w:tc>
+        <w:tc>
+          <w:tcPr/>
+          <w:p>
+            <w:pPr>
+              <w:pStyle w:val="Compact"/>
+              <w:jc w:val="left"/>
+            </w:pPr>
+            <w:r>
+              <w:t xml:space="preserve">84.9</w:t>
+            </w:r>
+          </w:p>
+        </w:tc>
+        <w:tc>
+          <w:tcPr/>
+          <w:p>
+            <w:pPr>
+              <w:pStyle w:val="Compact"/>
+              <w:jc w:val="left"/>
+            </w:pPr>
+            <w:r>
+              <w:t xml:space="preserve">20/39</w:t>
+            </w:r>
+          </w:p>
+        </w:tc>
+        <w:tc>
+          <w:tcPr/>
+          <w:p>
+            <w:pPr>
+              <w:pStyle w:val="Compact"/>
+              <w:jc w:val="left"/>
+            </w:pPr>
+            <w:r>
+              <w:t xml:space="preserve">57.1</w:t>
+            </w:r>
+          </w:p>
+        </w:tc>
+        <w:tc>
+          <w:tcPr/>
+          <w:p>
+            <w:pPr>
+              <w:pStyle w:val="Compact"/>
+              <w:jc w:val="left"/>
+            </w:pPr>
+            <w:r>
+              <w:t xml:space="preserve">88.8</w:t>
+            </w:r>
+          </w:p>
+        </w:tc>
+        <w:tc>
+          <w:tcPr/>
+          <w:p>
+            <w:pPr>
+              <w:pStyle w:val="Compact"/>
+              <w:jc w:val="left"/>
+            </w:pPr>
+            <w:r>
+              <w:t xml:space="preserve">28/39</w:t>
+            </w:r>
+          </w:p>
+        </w:tc>
+      </w:tr>
+      <w:tr>
+        <w:tc>
+          <w:tcPr/>
+          <w:p>
+            <w:pPr>
+              <w:pStyle w:val="Compact"/>
+              <w:jc w:val="left"/>
+            </w:pPr>
+            <w:r>
+              <w:t xml:space="preserve">MobileNetV3-Large</w:t>
+            </w:r>
+          </w:p>
+        </w:tc>
+        <w:tc>
+          <w:tcPr/>
+          <w:p>
+            <w:pPr>
+              <w:pStyle w:val="Compact"/>
+              <w:jc w:val="left"/>
+            </w:pPr>
+            <w:r>
+              <w:t xml:space="preserve">63.3</w:t>
+            </w:r>
+          </w:p>
+        </w:tc>
+        <w:tc>
+          <w:tcPr/>
+          <w:p>
+            <w:pPr>
+              <w:pStyle w:val="Compact"/>
+              <w:jc w:val="left"/>
+            </w:pPr>
+            <w:r>
+              <w:t xml:space="preserve">74.4</w:t>
+            </w:r>
+          </w:p>
+        </w:tc>
+        <w:tc>
+          <w:tcPr/>
+          <w:p>
+            <w:pPr>
+              <w:pStyle w:val="Compact"/>
+              <w:jc w:val="left"/>
+            </w:pPr>
+            <w:r>
+              <w:t xml:space="preserve">12.63</w:t>
+            </w:r>
+          </w:p>
+        </w:tc>
+        <w:tc>
+          <w:tcPr/>
+          <w:p>
+            <w:pPr>
+              <w:pStyle w:val="Compact"/>
+              <w:jc w:val="left"/>
+            </w:pPr>
+            <w:r>
+              <w:t xml:space="preserve">94.3</w:t>
+            </w:r>
+          </w:p>
+        </w:tc>
+        <w:tc>
+          <w:tcPr/>
+          <w:p>
+            <w:pPr>
+              <w:pStyle w:val="Compact"/>
+              <w:jc w:val="left"/>
+            </w:pPr>
+            <w:r>
+              <w:t xml:space="preserve">83.8</w:t>
+            </w:r>
+          </w:p>
+        </w:tc>
+        <w:tc>
+          <w:tcPr/>
+          <w:p>
+            <w:pPr>
+              <w:pStyle w:val="Compact"/>
+              <w:jc w:val="left"/>
+            </w:pPr>
+            <w:r>
+              <w:t xml:space="preserve">57.2</w:t>
+            </w:r>
+          </w:p>
+        </w:tc>
+        <w:tc>
+          <w:tcPr/>
+          <w:p>
+            <w:pPr>
+              <w:pStyle w:val="Compact"/>
+              <w:jc w:val="left"/>
+            </w:pPr>
+            <w:r>
+              <w:t xml:space="preserve">84.6</w:t>
+            </w:r>
+          </w:p>
+        </w:tc>
+        <w:tc>
+          <w:tcPr/>
+          <w:p>
+            <w:pPr>
+              <w:pStyle w:val="Compact"/>
+              <w:jc w:val="left"/>
+            </w:pPr>
+            <w:r>
+              <w:t xml:space="preserve">24/38</w:t>
+            </w:r>
+          </w:p>
+        </w:tc>
+        <w:tc>
+          <w:tcPr/>
+          <w:p>
+            <w:pPr>
+              <w:pStyle w:val="Compact"/>
+              <w:jc w:val="left"/>
+            </w:pPr>
+            <w:r>
+              <w:t xml:space="preserve">43.3</w:t>
+            </w:r>
+          </w:p>
+        </w:tc>
+        <w:tc>
+          <w:tcPr/>
+          <w:p>
+            <w:pPr>
+              <w:pStyle w:val="Compact"/>
+              <w:jc w:val="left"/>
+            </w:pPr>
+            <w:r>
+              <w:t xml:space="preserve">90.4</w:t>
+            </w:r>
+          </w:p>
+        </w:tc>
+        <w:tc>
+          <w:tcPr/>
+          <w:p>
+            <w:pPr>
+              <w:pStyle w:val="Compact"/>
+              <w:jc w:val="left"/>
+            </w:pPr>
+            <w:r>
+              <w:t xml:space="preserve">19/37</w:t>
+            </w:r>
+          </w:p>
+        </w:tc>
+      </w:tr>
+      <w:tr>
+        <w:tc>
+          <w:tcPr/>
+          <w:p>
+            <w:pPr>
+              <w:pStyle w:val="Compact"/>
+              <w:jc w:val="left"/>
+            </w:pPr>
+            <w:r>
+              <w:t xml:space="preserve">MobileNetV4-Conv-Medium</w:t>
+            </w:r>
+          </w:p>
+        </w:tc>
+        <w:tc>
+          <w:tcPr/>
+          <w:p>
+            <w:pPr>
+              <w:pStyle w:val="Compact"/>
+              <w:jc w:val="left"/>
+            </w:pPr>
+            <w:r>
+              <w:t xml:space="preserve">56.9</w:t>
+            </w:r>
+          </w:p>
+        </w:tc>
+        <w:tc>
+          <w:tcPr/>
+          <w:p>
+            <w:pPr>
+              <w:pStyle w:val="Compact"/>
+              <w:jc w:val="left"/>
+            </w:pPr>
+            <w:r>
+              <w:t xml:space="preserve">68.7</w:t>
+            </w:r>
+          </w:p>
+        </w:tc>
+        <w:tc>
+          <w:tcPr/>
+          <w:p>
+            <w:pPr>
+              <w:pStyle w:val="Compact"/>
+              <w:jc w:val="left"/>
+            </w:pPr>
+            <w:r>
+              <w:t xml:space="preserve">16.83</w:t>
+            </w:r>
+          </w:p>
+        </w:tc>
+        <w:tc>
+          <w:tcPr/>
+          <w:p>
+            <w:pPr>
+              <w:pStyle w:val="Compact"/>
+              <w:jc w:val="left"/>
+            </w:pPr>
+            <w:r>
+              <w:t xml:space="preserve">93.9</w:t>
+            </w:r>
+          </w:p>
+        </w:tc>
+        <w:tc>
+          <w:tcPr/>
+          <w:p>
+            <w:pPr>
+              <w:pStyle w:val="Compact"/>
+              <w:jc w:val="left"/>
+            </w:pPr>
+            <w:r>
+              <w:t xml:space="preserve">78.3</w:t>
+            </w:r>
+          </w:p>
+        </w:tc>
+        <w:tc>
+          <w:tcPr/>
+          <w:p>
+            <w:pPr>
+              <w:pStyle w:val="Compact"/>
+              <w:jc w:val="left"/>
+            </w:pPr>
+            <w:r>
+              <w:t xml:space="preserve">61.4</w:t>
+            </w:r>
+          </w:p>
+        </w:tc>
+        <w:tc>
+          <w:tcPr/>
+          <w:p>
+            <w:pPr>
+              <w:pStyle w:val="Compact"/>
+              <w:jc w:val="left"/>
+            </w:pPr>
+            <w:r>
+              <w:t xml:space="preserve">79.9</w:t>
+            </w:r>
+          </w:p>
+        </w:tc>
+        <w:tc>
+          <w:tcPr/>
+          <w:p>
+            <w:pPr>
+              <w:pStyle w:val="Compact"/>
+              <w:jc w:val="left"/>
+            </w:pPr>
+            <w:r>
+              <w:t xml:space="preserve">29/38</w:t>
+            </w:r>
+          </w:p>
+        </w:tc>
+        <w:tc>
+          <w:tcPr/>
+          <w:p>
+            <w:pPr>
+              <w:pStyle w:val="Compact"/>
+              <w:jc w:val="left"/>
+            </w:pPr>
+            <w:r>
+              <w:t xml:space="preserve">48.8</w:t>
+            </w:r>
+          </w:p>
+        </w:tc>
+        <w:tc>
+          <w:tcPr/>
+          <w:p>
+            <w:pPr>
+              <w:pStyle w:val="Compact"/>
+              <w:jc w:val="left"/>
+            </w:pPr>
+            <w:r>
+              <w:t xml:space="preserve">84.0</w:t>
+            </w:r>
+          </w:p>
+        </w:tc>
+        <w:tc>
+          <w:tcPr/>
+          <w:p>
+            <w:pPr>
+              <w:pStyle w:val="Compact"/>
+              <w:jc w:val="left"/>
+            </w:pPr>
+            <w:r>
+              <w:t xml:space="preserve">28/38</w:t>
+            </w:r>
+          </w:p>
+        </w:tc>
+      </w:tr>
+      <w:tr>
+        <w:tc>
+          <w:tcPr/>
+          <w:p>
+            <w:pPr>
+              <w:pStyle w:val="Compact"/>
+              <w:jc w:val="left"/>
+            </w:pPr>
+            <w:r>
+              <w:t xml:space="preserve">ConvNeXt V2-Tiny</w:t>
+            </w:r>
+          </w:p>
+        </w:tc>
+        <w:tc>
+          <w:tcPr/>
+          <w:p>
+            <w:pPr>
+              <w:pStyle w:val="Compact"/>
+              <w:jc w:val="left"/>
+            </w:pPr>
+            <w:r>
+              <w:t xml:space="preserve">74.0</w:t>
+            </w:r>
+          </w:p>
+        </w:tc>
+        <w:tc>
+          <w:tcPr/>
+          <w:p>
+            <w:pPr>
+              <w:pStyle w:val="Compact"/>
+              <w:jc w:val="left"/>
+            </w:pPr>
+            <w:r>
+              <w:t xml:space="preserve">86.8</w:t>
+            </w:r>
+          </w:p>
+        </w:tc>
+        <w:tc>
+          <w:tcPr/>
+          <w:p>
+            <w:pPr>
+              <w:pStyle w:val="Compact"/>
+              <w:jc w:val="left"/>
+            </w:pPr>
+            <w:r>
+              <w:t xml:space="preserve">4.21</w:t>
+            </w:r>
+          </w:p>
+        </w:tc>
+        <w:tc>
+          <w:tcPr/>
+          <w:p>
+            <w:pPr>
+              <w:pStyle w:val="Compact"/>
+              <w:jc w:val="left"/>
+            </w:pPr>
+            <w:r>
+              <w:t xml:space="preserve">97.4</w:t>
+            </w:r>
+          </w:p>
+        </w:tc>
+        <w:tc>
+          <w:tcPr/>
+          <w:p>
+            <w:pPr>
+              <w:pStyle w:val="Compact"/>
+              <w:jc w:val="left"/>
+            </w:pPr>
+            <w:r>
+              <w:t xml:space="preserve">94.1</w:t>
+            </w:r>
+          </w:p>
+        </w:tc>
+        <w:tc>
+          <w:tcPr/>
+          <w:p>
+            <w:pPr>
+              <w:pStyle w:val="Compact"/>
+              <w:jc w:val="left"/>
+            </w:pPr>
+            <w:r>
+              <w:t xml:space="preserve">89.8</w:t>
+            </w:r>
+          </w:p>
+        </w:tc>
+        <w:tc>
+          <w:tcPr/>
+          <w:p>
+            <w:pPr>
+              <w:pStyle w:val="Compact"/>
+              <w:jc w:val="left"/>
+            </w:pPr>
+            <w:r>
+              <w:t xml:space="preserve">90.0</w:t>
+            </w:r>
+          </w:p>
+        </w:tc>
+        <w:tc>
+          <w:tcPr/>
+          <w:p>
+            <w:pPr>
+              <w:pStyle w:val="Compact"/>
+              <w:jc w:val="left"/>
+            </w:pPr>
+            <w:r>
+              <w:t xml:space="preserve">14/40</w:t>
+            </w:r>
+          </w:p>
+        </w:tc>
+        <w:tc>
+          <w:tcPr/>
+          <w:p>
+            <w:pPr>
+              <w:pStyle w:val="Compact"/>
+              <w:jc w:val="left"/>
+            </w:pPr>
+            <w:r>
+              <w:t xml:space="preserve">84.8</w:t>
+            </w:r>
+          </w:p>
+        </w:tc>
+        <w:tc>
+          <w:tcPr/>
+          <w:p>
+            <w:pPr>
+              <w:pStyle w:val="Compact"/>
+              <w:jc w:val="left"/>
+            </w:pPr>
+            <w:r>
+              <w:t xml:space="preserve">91.1</w:t>
+            </w:r>
+          </w:p>
+        </w:tc>
+        <w:tc>
+          <w:tcPr/>
+          <w:p>
+            <w:pPr>
+              <w:pStyle w:val="Compact"/>
+              <w:jc w:val="left"/>
+            </w:pPr>
+            <w:r>
+              <w:t xml:space="preserve">28/40</w:t>
+            </w:r>
+          </w:p>
+        </w:tc>
+      </w:tr>
+      <w:tr>
+        <w:tc>
+          <w:tcPr/>
+          <w:p>
+            <w:pPr>
+              <w:pStyle w:val="Compact"/>
+              <w:jc w:val="left"/>
+            </w:pPr>
+            <w:r>
+              <w:t xml:space="preserve">ViT-S/16</w:t>
+            </w:r>
+          </w:p>
+        </w:tc>
+        <w:tc>
+          <w:tcPr/>
+          <w:p>
+            <w:pPr>
+              <w:pStyle w:val="Compact"/>
+              <w:jc w:val="left"/>
+            </w:pPr>
+            <w:r>
+              <w:t xml:space="preserve">73.8</w:t>
+            </w:r>
+          </w:p>
+        </w:tc>
+        <w:tc>
+          <w:tcPr/>
+          <w:p>
+            <w:pPr>
+              <w:pStyle w:val="Compact"/>
+              <w:jc w:val="left"/>
+            </w:pPr>
+            <w:r>
+              <w:t xml:space="preserve">85.2</w:t>
+            </w:r>
+          </w:p>
+        </w:tc>
+        <w:tc>
+          <w:tcPr/>
+          <w:p>
+            <w:pPr>
+              <w:pStyle w:val="Compact"/>
+              <w:jc w:val="left"/>
+            </w:pPr>
+            <w:r>
+              <w:t xml:space="preserve">4.54</w:t>
+            </w:r>
+          </w:p>
+        </w:tc>
+        <w:tc>
+          <w:tcPr/>
+          <w:p>
+            <w:pPr>
+              <w:pStyle w:val="Compact"/>
+              <w:jc w:val="left"/>
+            </w:pPr>
+            <w:r>
+              <w:t xml:space="preserve">96.7</w:t>
+            </w:r>
+          </w:p>
+        </w:tc>
+        <w:tc>
+          <w:tcPr/>
+          <w:p>
+            <w:pPr>
+              <w:pStyle w:val="Compact"/>
+              <w:jc w:val="left"/>
+            </w:pPr>
+            <w:r>
+              <w:t xml:space="preserve">93.8</w:t>
+            </w:r>
+          </w:p>
+        </w:tc>
+        <w:tc>
+          <w:tcPr/>
+          <w:p>
+            <w:pPr>
+              <w:pStyle w:val="Compact"/>
+              <w:jc w:val="left"/>
+            </w:pPr>
+            <w:r>
+              <w:t xml:space="preserve">88.3</w:t>
+            </w:r>
+          </w:p>
+        </w:tc>
+        <w:tc>
+          <w:tcPr/>
+          <w:p>
+            <w:pPr>
+              <w:pStyle w:val="Compact"/>
+              <w:jc w:val="left"/>
+            </w:pPr>
+            <w:r>
+              <w:t xml:space="preserve">89.2</w:t>
+            </w:r>
+          </w:p>
+        </w:tc>
+        <w:tc>
+          <w:tcPr/>
+          <w:p>
+            <w:pPr>
+              <w:pStyle w:val="Compact"/>
+              <w:jc w:val="left"/>
+            </w:pPr>
+            <w:r>
+              <w:t xml:space="preserve">18/40</w:t>
+            </w:r>
+          </w:p>
+        </w:tc>
+        <w:tc>
+          <w:tcPr/>
+          <w:p>
+            <w:pPr>
+              <w:pStyle w:val="Compact"/>
+              <w:jc w:val="left"/>
+            </w:pPr>
+            <w:r>
+              <w:t xml:space="preserve">76.9</w:t>
+            </w:r>
+          </w:p>
+        </w:tc>
+        <w:tc>
+          <w:tcPr/>
+          <w:p>
+            <w:pPr>
+              <w:pStyle w:val="Compact"/>
+              <w:jc w:val="left"/>
+            </w:pPr>
+            <w:r>
+              <w:t xml:space="preserve">92.3</w:t>
+            </w:r>
+          </w:p>
+        </w:tc>
+        <w:tc>
+          <w:tcPr/>
+          <w:p>
+            <w:pPr>
+              <w:pStyle w:val="Compact"/>
+              <w:jc w:val="left"/>
+            </w:pPr>
+            <w:r>
+              <w:t xml:space="preserve">24/40</w:t>
+            </w:r>
+          </w:p>
+        </w:tc>
+      </w:tr>
+    </w:tbl>
+    <w:bookmarkEnd w:id="45"/>
+    <w:bookmarkStart w:id="46" w:name="X7aa602aa6bf726bd5e80fc20d2c2a01bde6b1b4"/>
+    <w:p>
+      <w:pPr>
+        <w:pStyle w:val="Heading2"/>
+      </w:pPr>
+      <w:r>
+        <w:t xml:space="preserve">Table S20. Top-2 hit rate and errors among automatically decided images, by true class (primary scoring, video frames excluded)</w:t>
+      </w:r>
+    </w:p>
+    <w:p>
+      <w:pPr>
+        <w:pStyle w:val="FirstParagraph"/>
+      </w:pPr>
+      <w:r>
+        <w:t xml:space="preserve">Pooled over the 40 runs of each backbone (images, not run means). Top-2: the correct class was among the two most probable. Decided: confidence reached the threshold set on the validation images for a 90 % target. Error among decided: share of decided images of that class that were misclassified.</w:t>
+      </w:r>
+      <w:r>
+        <w:t xml:space="preserve"> </w:t>
+      </w:r>
+      <w:r>
+        <w:rPr>
+          <w:iCs/>
+          <w:i/>
+        </w:rPr>
+        <w:t xml:space="preserve">Phomopsis</w:t>
+      </w:r>
+      <w:r>
+        <w:t xml:space="preserve"> </w:t>
+      </w:r>
+      <w:r>
+        <w:t xml:space="preserve">images come essentially from one capture group.</w:t>
+      </w:r>
+    </w:p>
+    <w:tbl>
+      <w:tblPr>
+        <w:tblStyle w:val="Table"/>
+        <w:tblW w:type="pct" w:w="5000"/>
+        <w:tblLook w:firstRow="1" w:lastRow="0" w:firstColumn="0" w:lastColumn="0" w:noHBand="0" w:noVBand="0" w:val="0020"/>
+        <w:jc w:val="start"/>
+      </w:tblPr>
+      <w:tblGrid>
+        <w:gridCol w:w="1777"/>
+        <w:gridCol w:w="1777"/>
+        <w:gridCol w:w="808"/>
+        <w:gridCol w:w="808"/>
+        <w:gridCol w:w="808"/>
+        <w:gridCol w:w="808"/>
+        <w:gridCol w:w="1131"/>
+      </w:tblGrid>
+      <w:tr>
+        <w:trPr>
+          <w:tblHeader w:val="true"/>
+        </w:trPr>
+        <w:tc>
+          <w:tcPr/>
+          <w:p>
+            <w:pPr>
+              <w:pStyle w:val="Compact"/>
+              <w:jc w:val="left"/>
+            </w:pPr>
+            <w:r>
+              <w:t xml:space="preserve">Backbone</w:t>
+            </w:r>
+          </w:p>
+        </w:tc>
+        <w:tc>
+          <w:tcPr/>
+          <w:p>
+            <w:pPr>
+              <w:pStyle w:val="Compact"/>
+              <w:jc w:val="left"/>
+            </w:pPr>
+            <w:r>
+              <w:t xml:space="preserve">Class</w:t>
+            </w:r>
+          </w:p>
+        </w:tc>
+        <w:tc>
+          <w:tcPr/>
+          <w:p>
+            <w:pPr>
+              <w:pStyle w:val="Compact"/>
+              <w:jc w:val="left"/>
+            </w:pPr>
+            <w:r>
+              <w:t xml:space="preserve">Test images</w:t>
+            </w:r>
+          </w:p>
+        </w:tc>
+        <w:tc>
+          <w:tcPr/>
+          <w:p>
+            <w:pPr>
+              <w:pStyle w:val="Compact"/>
+              <w:jc w:val="left"/>
+            </w:pPr>
+            <w:r>
+              <w:t xml:space="preserve">Recall (%)</w:t>
+            </w:r>
+          </w:p>
+        </w:tc>
+        <w:tc>
+          <w:tcPr/>
+          <w:p>
+            <w:pPr>
+              <w:pStyle w:val="Compact"/>
+              <w:jc w:val="left"/>
+            </w:pPr>
+            <w:r>
+              <w:t xml:space="preserve">Top-2 (%)</w:t>
+            </w:r>
+          </w:p>
+        </w:tc>
+        <w:tc>
+          <w:tcPr/>
+          <w:p>
+            <w:pPr>
+              <w:pStyle w:val="Compact"/>
+              <w:jc w:val="left"/>
+            </w:pPr>
+            <w:r>
+              <w:t xml:space="preserve">Decided (%)</w:t>
+            </w:r>
+          </w:p>
+        </w:tc>
+        <w:tc>
+          <w:tcPr/>
+          <w:p>
+            <w:pPr>
+              <w:pStyle w:val="Compact"/>
+              <w:jc w:val="left"/>
+            </w:pPr>
+            <w:r>
+              <w:t xml:space="preserve">Error among decided (%)</w:t>
+            </w:r>
+          </w:p>
+        </w:tc>
+      </w:tr>
+      <w:tr>
+        <w:tc>
+          <w:tcPr/>
+          <w:p>
+            <w:pPr>
+              <w:pStyle w:val="Compact"/>
+              <w:jc w:val="left"/>
+            </w:pPr>
+            <w:r>
+              <w:t xml:space="preserve">EfficientNet-B0</w:t>
+            </w:r>
+          </w:p>
+        </w:tc>
+        <w:tc>
+          <w:tcPr/>
+          <w:p>
+            <w:pPr>
+              <w:pStyle w:val="Compact"/>
+              <w:jc w:val="left"/>
+            </w:pPr>
+            <w:r>
+              <w:t xml:space="preserve">Algal leaf spot</w:t>
+            </w:r>
+          </w:p>
+        </w:tc>
+        <w:tc>
+          <w:tcPr/>
+          <w:p>
+            <w:pPr>
+              <w:pStyle w:val="Compact"/>
+              <w:jc w:val="left"/>
+            </w:pPr>
+            <w:r>
+              <w:t xml:space="preserve">1620</w:t>
+            </w:r>
+          </w:p>
+        </w:tc>
+        <w:tc>
+          <w:tcPr/>
+          <w:p>
+            <w:pPr>
+              <w:pStyle w:val="Compact"/>
+              <w:jc w:val="left"/>
+            </w:pPr>
+            <w:r>
+              <w:t xml:space="preserve">63.9</w:t>
+            </w:r>
+          </w:p>
+        </w:tc>
+        <w:tc>
+          <w:tcPr/>
+          <w:p>
+            <w:pPr>
+              <w:pStyle w:val="Compact"/>
+              <w:jc w:val="left"/>
+            </w:pPr>
+            <w:r>
+              <w:t xml:space="preserve">92.8</w:t>
+            </w:r>
+          </w:p>
+        </w:tc>
+        <w:tc>
+          <w:tcPr/>
+          <w:p>
+            <w:pPr>
+              <w:pStyle w:val="Compact"/>
+              <w:jc w:val="left"/>
+            </w:pPr>
+            <w:r>
+              <w:t xml:space="preserve">61.1</w:t>
+            </w:r>
+          </w:p>
+        </w:tc>
+        <w:tc>
+          <w:tcPr/>
+          <w:p>
+            <w:pPr>
+              <w:pStyle w:val="Compact"/>
+              <w:jc w:val="left"/>
+            </w:pPr>
+            <w:r>
+              <w:t xml:space="preserve">29.4</w:t>
+            </w:r>
+          </w:p>
+        </w:tc>
+      </w:tr>
+      <w:tr>
+        <w:tc>
+          <w:tcPr/>
+          <w:p>
+            <w:pPr>
+              <w:pStyle w:val="Compact"/>
+              <w:jc w:val="left"/>
+            </w:pPr>
+            <w:r>
+              <w:t xml:space="preserve">EfficientNet-B0</w:t>
+            </w:r>
+          </w:p>
+        </w:tc>
+        <w:tc>
+          <w:tcPr/>
+          <w:p>
+            <w:pPr>
+              <w:pStyle w:val="Compact"/>
+              <w:jc w:val="left"/>
+            </w:pPr>
+            <w:r>
+              <w:t xml:space="preserve">Leaf blight</w:t>
+            </w:r>
+          </w:p>
+        </w:tc>
+        <w:tc>
+          <w:tcPr/>
+          <w:p>
+            <w:pPr>
+              <w:pStyle w:val="Compact"/>
+              <w:jc w:val="left"/>
+            </w:pPr>
+            <w:r>
+              <w:t xml:space="preserve">1530</w:t>
+            </w:r>
+          </w:p>
+        </w:tc>
+        <w:tc>
+          <w:tcPr/>
+          <w:p>
+            <w:pPr>
+              <w:pStyle w:val="Compact"/>
+              <w:jc w:val="left"/>
+            </w:pPr>
+            <w:r>
+              <w:t xml:space="preserve">80.7</w:t>
+            </w:r>
+          </w:p>
+        </w:tc>
+        <w:tc>
+          <w:tcPr/>
+          <w:p>
+            <w:pPr>
+              <w:pStyle w:val="Compact"/>
+              <w:jc w:val="left"/>
+            </w:pPr>
+            <w:r>
+              <w:t xml:space="preserve">98.7</w:t>
+            </w:r>
+          </w:p>
+        </w:tc>
+        <w:tc>
+          <w:tcPr/>
+          <w:p>
+            <w:pPr>
+              <w:pStyle w:val="Compact"/>
+              <w:jc w:val="left"/>
+            </w:pPr>
+            <w:r>
+              <w:t xml:space="preserve">63.0</w:t>
+            </w:r>
+          </w:p>
+        </w:tc>
+        <w:tc>
+          <w:tcPr/>
+          <w:p>
+            <w:pPr>
+              <w:pStyle w:val="Compact"/>
+              <w:jc w:val="left"/>
+            </w:pPr>
+            <w:r>
+              <w:t xml:space="preserve">16.9</w:t>
+            </w:r>
+          </w:p>
+        </w:tc>
+      </w:tr>
+      <w:tr>
+        <w:tc>
+          <w:tcPr/>
+          <w:p>
+            <w:pPr>
+              <w:pStyle w:val="Compact"/>
+              <w:jc w:val="left"/>
+            </w:pPr>
+            <w:r>
+              <w:t xml:space="preserve">EfficientNet-B0</w:t>
+            </w:r>
+          </w:p>
+        </w:tc>
+        <w:tc>
+          <w:tcPr/>
+          <w:p>
+            <w:pPr>
+              <w:pStyle w:val="Compact"/>
+              <w:jc w:val="left"/>
+            </w:pPr>
+            <w:r>
+              <w:t xml:space="preserve">Phomopsis leaf spot</w:t>
+            </w:r>
+          </w:p>
+        </w:tc>
+        <w:tc>
+          <w:tcPr/>
+          <w:p>
+            <w:pPr>
+              <w:pStyle w:val="Compact"/>
+              <w:jc w:val="left"/>
+            </w:pPr>
+            <w:r>
+              <w:t xml:space="preserve">940</w:t>
+            </w:r>
+          </w:p>
+        </w:tc>
+        <w:tc>
+          <w:tcPr/>
+          <w:p>
+            <w:pPr>
+              <w:pStyle w:val="Compact"/>
+              <w:jc w:val="left"/>
+            </w:pPr>
+            <w:r>
+              <w:t xml:space="preserve">42.9</w:t>
+            </w:r>
+          </w:p>
+        </w:tc>
+        <w:tc>
+          <w:tcPr/>
+          <w:p>
+            <w:pPr>
+              <w:pStyle w:val="Compact"/>
+              <w:jc w:val="left"/>
+            </w:pPr>
+            <w:r>
+              <w:t xml:space="preserve">74.0</w:t>
+            </w:r>
+          </w:p>
+        </w:tc>
+        <w:tc>
+          <w:tcPr/>
+          <w:p>
+            <w:pPr>
+              <w:pStyle w:val="Compact"/>
+              <w:jc w:val="left"/>
+            </w:pPr>
+            <w:r>
+              <w:t xml:space="preserve">35.4</w:t>
+            </w:r>
+          </w:p>
+        </w:tc>
+        <w:tc>
+          <w:tcPr/>
+          <w:p>
+            <w:pPr>
+              <w:pStyle w:val="Compact"/>
+              <w:jc w:val="left"/>
+            </w:pPr>
+            <w:r>
+              <w:t xml:space="preserve">54.1</w:t>
+            </w:r>
+          </w:p>
+        </w:tc>
+      </w:tr>
+      <w:tr>
+        <w:tc>
+          <w:tcPr/>
+          <w:p>
+            <w:pPr>
+              <w:pStyle w:val="Compact"/>
+              <w:jc w:val="left"/>
+            </w:pPr>
+            <w:r>
+              <w:t xml:space="preserve">EfficientNet-B0</w:t>
+            </w:r>
+          </w:p>
+        </w:tc>
+        <w:tc>
+          <w:tcPr/>
+          <w:p>
+            <w:pPr>
+              <w:pStyle w:val="Compact"/>
+              <w:jc w:val="left"/>
+            </w:pPr>
+            <w:r>
+              <w:t xml:space="preserve">Root and collar rot</w:t>
+            </w:r>
+          </w:p>
+        </w:tc>
+        <w:tc>
+          <w:tcPr/>
+          <w:p>
+            <w:pPr>
+              <w:pStyle w:val="Compact"/>
+              <w:jc w:val="left"/>
+            </w:pPr>
+            <w:r>
+              <w:t xml:space="preserve">780</w:t>
+            </w:r>
+          </w:p>
+        </w:tc>
+        <w:tc>
+          <w:tcPr/>
+          <w:p>
+            <w:pPr>
+              <w:pStyle w:val="Compact"/>
+              <w:jc w:val="left"/>
+            </w:pPr>
+            <w:r>
+              <w:t xml:space="preserve">99.2</w:t>
+            </w:r>
+          </w:p>
+        </w:tc>
+        <w:tc>
+          <w:tcPr/>
+          <w:p>
+            <w:pPr>
+              <w:pStyle w:val="Compact"/>
+              <w:jc w:val="left"/>
+            </w:pPr>
+            <w:r>
+              <w:t xml:space="preserve">99.7</w:t>
+            </w:r>
+          </w:p>
+        </w:tc>
+        <w:tc>
+          <w:tcPr/>
+          <w:p>
+            <w:pPr>
+              <w:pStyle w:val="Compact"/>
+              <w:jc w:val="left"/>
+            </w:pPr>
+            <w:r>
+              <w:t xml:space="preserve">94.4</w:t>
+            </w:r>
+          </w:p>
+        </w:tc>
+        <w:tc>
+          <w:tcPr/>
+          <w:p>
+            <w:pPr>
+              <w:pStyle w:val="Compact"/>
+              <w:jc w:val="left"/>
+            </w:pPr>
+            <w:r>
+              <w:t xml:space="preserve">0.1</w:t>
+            </w:r>
+          </w:p>
+        </w:tc>
+      </w:tr>
+      <w:tr>
+        <w:tc>
+          <w:tcPr/>
+          <w:p>
+            <w:pPr>
+              <w:pStyle w:val="Compact"/>
+              <w:jc w:val="left"/>
+            </w:pPr>
+            <w:r>
+              <w:t xml:space="preserve">MobileNetV3-Large</w:t>
+            </w:r>
+          </w:p>
+        </w:tc>
+        <w:tc>
+          <w:tcPr/>
+          <w:p>
+            <w:pPr>
+              <w:pStyle w:val="Compact"/>
+              <w:jc w:val="left"/>
+            </w:pPr>
+            <w:r>
+              <w:t xml:space="preserve">Algal leaf spot</w:t>
+            </w:r>
+          </w:p>
+        </w:tc>
+        <w:tc>
+          <w:tcPr/>
+          <w:p>
+            <w:pPr>
+              <w:pStyle w:val="Compact"/>
+              <w:jc w:val="left"/>
+            </w:pPr>
+            <w:r>
+              <w:t xml:space="preserve">1620</w:t>
+            </w:r>
+          </w:p>
+        </w:tc>
+        <w:tc>
+          <w:tcPr/>
+          <w:p>
+            <w:pPr>
+              <w:pStyle w:val="Compact"/>
+              <w:jc w:val="left"/>
+            </w:pPr>
+            <w:r>
+              <w:t xml:space="preserve">64.6</w:t>
+            </w:r>
+          </w:p>
+        </w:tc>
+        <w:tc>
+          <w:tcPr/>
+          <w:p>
+            <w:pPr>
+              <w:pStyle w:val="Compact"/>
+              <w:jc w:val="left"/>
+            </w:pPr>
+            <w:r>
+              <w:t xml:space="preserve">92.4</w:t>
+            </w:r>
+          </w:p>
+        </w:tc>
+        <w:tc>
+          <w:tcPr/>
+          <w:p>
+            <w:pPr>
+              <w:pStyle w:val="Compact"/>
+              <w:jc w:val="left"/>
+            </w:pPr>
+            <w:r>
+              <w:t xml:space="preserve">54.6</w:t>
+            </w:r>
+          </w:p>
+        </w:tc>
+        <w:tc>
+          <w:tcPr/>
+          <w:p>
+            <w:pPr>
+              <w:pStyle w:val="Compact"/>
+              <w:jc w:val="left"/>
+            </w:pPr>
+            <w:r>
+              <w:t xml:space="preserve">28.2</w:t>
+            </w:r>
+          </w:p>
+        </w:tc>
+      </w:tr>
+      <w:tr>
+        <w:tc>
+          <w:tcPr/>
+          <w:p>
+            <w:pPr>
+              <w:pStyle w:val="Compact"/>
+              <w:jc w:val="left"/>
+            </w:pPr>
+            <w:r>
+              <w:t xml:space="preserve">MobileNetV3-Large</w:t>
+            </w:r>
+          </w:p>
+        </w:tc>
+        <w:tc>
+          <w:tcPr/>
+          <w:p>
+            <w:pPr>
+              <w:pStyle w:val="Compact"/>
+              <w:jc w:val="left"/>
+            </w:pPr>
+            <w:r>
+              <w:t xml:space="preserve">Leaf blight</w:t>
+            </w:r>
+          </w:p>
+        </w:tc>
+        <w:tc>
+          <w:tcPr/>
+          <w:p>
+            <w:pPr>
+              <w:pStyle w:val="Compact"/>
+              <w:jc w:val="left"/>
+            </w:pPr>
+            <w:r>
+              <w:t xml:space="preserve">1530</w:t>
+            </w:r>
+          </w:p>
+        </w:tc>
+        <w:tc>
+          <w:tcPr/>
+          <w:p>
+            <w:pPr>
+              <w:pStyle w:val="Compact"/>
+              <w:jc w:val="left"/>
+            </w:pPr>
+            <w:r>
+              <w:t xml:space="preserve">75.9</w:t>
+            </w:r>
+          </w:p>
+        </w:tc>
+        <w:tc>
+          <w:tcPr/>
+          <w:p>
+            <w:pPr>
+              <w:pStyle w:val="Compact"/>
+              <w:jc w:val="left"/>
+            </w:pPr>
+            <w:r>
+              <w:t xml:space="preserve">96.9</w:t>
+            </w:r>
+          </w:p>
+        </w:tc>
+        <w:tc>
+          <w:tcPr/>
+          <w:p>
+            <w:pPr>
+              <w:pStyle w:val="Compact"/>
+              <w:jc w:val="left"/>
+            </w:pPr>
+            <w:r>
+              <w:t xml:space="preserve">52.9</w:t>
+            </w:r>
+          </w:p>
+        </w:tc>
+        <w:tc>
+          <w:tcPr/>
+          <w:p>
+            <w:pPr>
+              <w:pStyle w:val="Compact"/>
+              <w:jc w:val="left"/>
+            </w:pPr>
+            <w:r>
+              <w:t xml:space="preserve">21.1</w:t>
+            </w:r>
+          </w:p>
+        </w:tc>
+      </w:tr>
+      <w:tr>
+        <w:tc>
+          <w:tcPr/>
+          <w:p>
+            <w:pPr>
+              <w:pStyle w:val="Compact"/>
+              <w:jc w:val="left"/>
+            </w:pPr>
+            <w:r>
+              <w:t xml:space="preserve">MobileNetV3-Large</w:t>
+            </w:r>
+          </w:p>
+        </w:tc>
+        <w:tc>
+          <w:tcPr/>
+          <w:p>
+            <w:pPr>
+              <w:pStyle w:val="Compact"/>
+              <w:jc w:val="left"/>
+            </w:pPr>
+            <w:r>
+              <w:t xml:space="preserve">Phomopsis leaf spot</w:t>
+            </w:r>
+          </w:p>
+        </w:tc>
+        <w:tc>
+          <w:tcPr/>
+          <w:p>
+            <w:pPr>
+              <w:pStyle w:val="Compact"/>
+              <w:jc w:val="left"/>
+            </w:pPr>
+            <w:r>
+              <w:t xml:space="preserve">940</w:t>
+            </w:r>
+          </w:p>
+        </w:tc>
+        <w:tc>
+          <w:tcPr/>
+          <w:p>
+            <w:pPr>
+              <w:pStyle w:val="Compact"/>
+              <w:jc w:val="left"/>
+            </w:pPr>
+            <w:r>
+              <w:t xml:space="preserve">46.3</w:t>
+            </w:r>
+          </w:p>
+        </w:tc>
+        <w:tc>
+          <w:tcPr/>
+          <w:p>
+            <w:pPr>
+              <w:pStyle w:val="Compact"/>
+              <w:jc w:val="left"/>
+            </w:pPr>
+            <w:r>
+              <w:t xml:space="preserve">72.7</w:t>
+            </w:r>
+          </w:p>
+        </w:tc>
+        <w:tc>
+          <w:tcPr/>
+          <w:p>
+            <w:pPr>
+              <w:pStyle w:val="Compact"/>
+              <w:jc w:val="left"/>
+            </w:pPr>
+            <w:r>
+              <w:t xml:space="preserve">38.9</w:t>
+            </w:r>
+          </w:p>
+        </w:tc>
+        <w:tc>
+          <w:tcPr/>
+          <w:p>
+            <w:pPr>
+              <w:pStyle w:val="Compact"/>
+              <w:jc w:val="left"/>
+            </w:pPr>
+            <w:r>
+              <w:t xml:space="preserve">42.9</w:t>
+            </w:r>
+          </w:p>
+        </w:tc>
+      </w:tr>
+      <w:tr>
+        <w:tc>
+          <w:tcPr/>
+          <w:p>
+            <w:pPr>
+              <w:pStyle w:val="Compact"/>
+              <w:jc w:val="left"/>
+            </w:pPr>
+            <w:r>
+              <w:t xml:space="preserve">MobileNetV3-Large</w:t>
+            </w:r>
+          </w:p>
+        </w:tc>
+        <w:tc>
+          <w:tcPr/>
+          <w:p>
+            <w:pPr>
+              <w:pStyle w:val="Compact"/>
+              <w:jc w:val="left"/>
+            </w:pPr>
+            <w:r>
+              <w:t xml:space="preserve">Root and collar rot</w:t>
+            </w:r>
+          </w:p>
+        </w:tc>
+        <w:tc>
+          <w:tcPr/>
+          <w:p>
+            <w:pPr>
+              <w:pStyle w:val="Compact"/>
+              <w:jc w:val="left"/>
+            </w:pPr>
+            <w:r>
+              <w:t xml:space="preserve">780</w:t>
+            </w:r>
+          </w:p>
+        </w:tc>
+        <w:tc>
+          <w:tcPr/>
+          <w:p>
+            <w:pPr>
+              <w:pStyle w:val="Compact"/>
+              <w:jc w:val="left"/>
+            </w:pPr>
+            <w:r>
+              <w:t xml:space="preserve">97.2</w:t>
+            </w:r>
+          </w:p>
+        </w:tc>
+        <w:tc>
+          <w:tcPr/>
+          <w:p>
+            <w:pPr>
+              <w:pStyle w:val="Compact"/>
+              <w:jc w:val="left"/>
+            </w:pPr>
+            <w:r>
+              <w:t xml:space="preserve">99.5</w:t>
+            </w:r>
+          </w:p>
+        </w:tc>
+        <w:tc>
+          <w:tcPr/>
+          <w:p>
+            <w:pPr>
+              <w:pStyle w:val="Compact"/>
+              <w:jc w:val="left"/>
+            </w:pPr>
+            <w:r>
+              <w:t xml:space="preserve">86.7</w:t>
+            </w:r>
+          </w:p>
+        </w:tc>
+        <w:tc>
+          <w:tcPr/>
+          <w:p>
+            <w:pPr>
+              <w:pStyle w:val="Compact"/>
+              <w:jc w:val="left"/>
+            </w:pPr>
+            <w:r>
+              <w:t xml:space="preserve">1.2</w:t>
+            </w:r>
+          </w:p>
+        </w:tc>
+      </w:tr>
+      <w:tr>
+        <w:tc>
+          <w:tcPr/>
+          <w:p>
+            <w:pPr>
+              <w:pStyle w:val="Compact"/>
+              <w:jc w:val="left"/>
+            </w:pPr>
+            <w:r>
+              <w:t xml:space="preserve">MobileNetV4-Conv-Medium</w:t>
+            </w:r>
+          </w:p>
+        </w:tc>
+        <w:tc>
+          <w:tcPr/>
+          <w:p>
+            <w:pPr>
+              <w:pStyle w:val="Compact"/>
+              <w:jc w:val="left"/>
+            </w:pPr>
+            <w:r>
+              <w:t xml:space="preserve">Algal leaf spot</w:t>
+            </w:r>
+          </w:p>
+        </w:tc>
+        <w:tc>
+          <w:tcPr/>
+          <w:p>
+            <w:pPr>
+              <w:pStyle w:val="Compact"/>
+              <w:jc w:val="left"/>
+            </w:pPr>
+            <w:r>
+              <w:t xml:space="preserve">1620</w:t>
+            </w:r>
+          </w:p>
+        </w:tc>
+        <w:tc>
+          <w:tcPr/>
+          <w:p>
+            <w:pPr>
+              <w:pStyle w:val="Compact"/>
+              <w:jc w:val="left"/>
+            </w:pPr>
+            <w:r>
+              <w:t xml:space="preserve">57.5</w:t>
+            </w:r>
+          </w:p>
+        </w:tc>
+        <w:tc>
+          <w:tcPr/>
+          <w:p>
+            <w:pPr>
+              <w:pStyle w:val="Compact"/>
+              <w:jc w:val="left"/>
+            </w:pPr>
+            <w:r>
+              <w:t xml:space="preserve">90.2</w:t>
+            </w:r>
+          </w:p>
+        </w:tc>
+        <w:tc>
+          <w:tcPr/>
+          <w:p>
+            <w:pPr>
+              <w:pStyle w:val="Compact"/>
+              <w:jc w:val="left"/>
+            </w:pPr>
+            <w:r>
+              <w:t xml:space="preserve">55.8</w:t>
+            </w:r>
+          </w:p>
+        </w:tc>
+        <w:tc>
+          <w:tcPr/>
+          <w:p>
+            <w:pPr>
+              <w:pStyle w:val="Compact"/>
+              <w:jc w:val="left"/>
+            </w:pPr>
+            <w:r>
+              <w:t xml:space="preserve">34.2</w:t>
+            </w:r>
+          </w:p>
+        </w:tc>
+      </w:tr>
+      <w:tr>
+        <w:tc>
+          <w:tcPr/>
+          <w:p>
+            <w:pPr>
+              <w:pStyle w:val="Compact"/>
+              <w:jc w:val="left"/>
+            </w:pPr>
+            <w:r>
+              <w:t xml:space="preserve">MobileNetV4-Conv-Medium</w:t>
+            </w:r>
+          </w:p>
+        </w:tc>
+        <w:tc>
+          <w:tcPr/>
+          <w:p>
+            <w:pPr>
+              <w:pStyle w:val="Compact"/>
+              <w:jc w:val="left"/>
+            </w:pPr>
+            <w:r>
+              <w:t xml:space="preserve">Leaf blight</w:t>
+            </w:r>
+          </w:p>
+        </w:tc>
+        <w:tc>
+          <w:tcPr/>
+          <w:p>
+            <w:pPr>
+              <w:pStyle w:val="Compact"/>
+              <w:jc w:val="left"/>
+            </w:pPr>
+            <w:r>
+              <w:t xml:space="preserve">1530</w:t>
+            </w:r>
+          </w:p>
+        </w:tc>
+        <w:tc>
+          <w:tcPr/>
+          <w:p>
+            <w:pPr>
+              <w:pStyle w:val="Compact"/>
+              <w:jc w:val="left"/>
+            </w:pPr>
+            <w:r>
+              <w:t xml:space="preserve">69.5</w:t>
+            </w:r>
+          </w:p>
+        </w:tc>
+        <w:tc>
+          <w:tcPr/>
+          <w:p>
+            <w:pPr>
+              <w:pStyle w:val="Compact"/>
+              <w:jc w:val="left"/>
+            </w:pPr>
+            <w:r>
+              <w:t xml:space="preserve">98.1</w:t>
+            </w:r>
+          </w:p>
+        </w:tc>
+        <w:tc>
+          <w:tcPr/>
+          <w:p>
+            <w:pPr>
+              <w:pStyle w:val="Compact"/>
+              <w:jc w:val="left"/>
+            </w:pPr>
+            <w:r>
+              <w:t xml:space="preserve">58.3</w:t>
+            </w:r>
+          </w:p>
+        </w:tc>
+        <w:tc>
+          <w:tcPr/>
+          <w:p>
+            <w:pPr>
+              <w:pStyle w:val="Compact"/>
+              <w:jc w:val="left"/>
+            </w:pPr>
+            <w:r>
+              <w:t xml:space="preserve">25.9</w:t>
+            </w:r>
+          </w:p>
+        </w:tc>
+      </w:tr>
+      <w:tr>
+        <w:tc>
+          <w:tcPr/>
+          <w:p>
+            <w:pPr>
+              <w:pStyle w:val="Compact"/>
+              <w:jc w:val="left"/>
+            </w:pPr>
+            <w:r>
+              <w:t xml:space="preserve">MobileNetV4-Conv-Medium</w:t>
+            </w:r>
+          </w:p>
+        </w:tc>
+        <w:tc>
+          <w:tcPr/>
+          <w:p>
+            <w:pPr>
+              <w:pStyle w:val="Compact"/>
+              <w:jc w:val="left"/>
+            </w:pPr>
+            <w:r>
+              <w:t xml:space="preserve">Phomopsis leaf spot</w:t>
+            </w:r>
+          </w:p>
+        </w:tc>
+        <w:tc>
+          <w:tcPr/>
+          <w:p>
+            <w:pPr>
+              <w:pStyle w:val="Compact"/>
+              <w:jc w:val="left"/>
+            </w:pPr>
+            <w:r>
+              <w:t xml:space="preserve">940</w:t>
+            </w:r>
+          </w:p>
+        </w:tc>
+        <w:tc>
+          <w:tcPr/>
+          <w:p>
+            <w:pPr>
+              <w:pStyle w:val="Compact"/>
+              <w:jc w:val="left"/>
+            </w:pPr>
+            <w:r>
+              <w:t xml:space="preserve">43.8</w:t>
+            </w:r>
+          </w:p>
+        </w:tc>
+        <w:tc>
+          <w:tcPr/>
+          <w:p>
+            <w:pPr>
+              <w:pStyle w:val="Compact"/>
+              <w:jc w:val="left"/>
+            </w:pPr>
+            <w:r>
+              <w:t xml:space="preserve">69.4</w:t>
+            </w:r>
+          </w:p>
+        </w:tc>
+        <w:tc>
+          <w:tcPr/>
+          <w:p>
+            <w:pPr>
+              <w:pStyle w:val="Compact"/>
+              <w:jc w:val="left"/>
+            </w:pPr>
+            <w:r>
+              <w:t xml:space="preserve">42.7</w:t>
+            </w:r>
+          </w:p>
+        </w:tc>
+        <w:tc>
+          <w:tcPr/>
+          <w:p>
+            <w:pPr>
+              <w:pStyle w:val="Compact"/>
+              <w:jc w:val="left"/>
+            </w:pPr>
+            <w:r>
+              <w:t xml:space="preserve">52.6</w:t>
+            </w:r>
+          </w:p>
+        </w:tc>
+      </w:tr>
+      <w:tr>
+        <w:tc>
+          <w:tcPr/>
+          <w:p>
+            <w:pPr>
+              <w:pStyle w:val="Compact"/>
+              <w:jc w:val="left"/>
+            </w:pPr>
+            <w:r>
+              <w:t xml:space="preserve">MobileNetV4-Conv-Medium</w:t>
+            </w:r>
+          </w:p>
+        </w:tc>
+        <w:tc>
+          <w:tcPr/>
+          <w:p>
+            <w:pPr>
+              <w:pStyle w:val="Compact"/>
+              <w:jc w:val="left"/>
+            </w:pPr>
+            <w:r>
+              <w:t xml:space="preserve">Root and collar rot</w:t>
+            </w:r>
+          </w:p>
+        </w:tc>
+        <w:tc>
+          <w:tcPr/>
+          <w:p>
+            <w:pPr>
+              <w:pStyle w:val="Compact"/>
+              <w:jc w:val="left"/>
+            </w:pPr>
+            <w:r>
+              <w:t xml:space="preserve">780</w:t>
+            </w:r>
+          </w:p>
+        </w:tc>
+        <w:tc>
+          <w:tcPr/>
+          <w:p>
+            <w:pPr>
+              <w:pStyle w:val="Compact"/>
+              <w:jc w:val="left"/>
+            </w:pPr>
+            <w:r>
+              <w:t xml:space="preserve">95.9</w:t>
+            </w:r>
+          </w:p>
+        </w:tc>
+        <w:tc>
+          <w:tcPr/>
+          <w:p>
+            <w:pPr>
+              <w:pStyle w:val="Compact"/>
+              <w:jc w:val="left"/>
+            </w:pPr>
+            <w:r>
+              <w:t xml:space="preserve">97.8</w:t>
+            </w:r>
+          </w:p>
+        </w:tc>
+        <w:tc>
+          <w:tcPr/>
+          <w:p>
+            <w:pPr>
+              <w:pStyle w:val="Compact"/>
+              <w:jc w:val="left"/>
+            </w:pPr>
+            <w:r>
+              <w:t xml:space="preserve">90.1</w:t>
+            </w:r>
+          </w:p>
+        </w:tc>
+        <w:tc>
+          <w:tcPr/>
+          <w:p>
+            <w:pPr>
+              <w:pStyle w:val="Compact"/>
+              <w:jc w:val="left"/>
+            </w:pPr>
+            <w:r>
+              <w:t xml:space="preserve">2.3</w:t>
+            </w:r>
+          </w:p>
+        </w:tc>
+      </w:tr>
+      <w:tr>
+        <w:tc>
+          <w:tcPr/>
+          <w:p>
+            <w:pPr>
+              <w:pStyle w:val="Compact"/>
+              <w:jc w:val="left"/>
+            </w:pPr>
+            <w:r>
+              <w:t xml:space="preserve">ConvNeXt V2-Tiny</w:t>
+            </w:r>
+          </w:p>
+        </w:tc>
+        <w:tc>
+          <w:tcPr/>
+          <w:p>
+            <w:pPr>
+              <w:pStyle w:val="Compact"/>
+              <w:jc w:val="left"/>
+            </w:pPr>
+            <w:r>
+              <w:t xml:space="preserve">Algal leaf spot</w:t>
+            </w:r>
+          </w:p>
+        </w:tc>
+        <w:tc>
+          <w:tcPr/>
+          <w:p>
+            <w:pPr>
+              <w:pStyle w:val="Compact"/>
+              <w:jc w:val="left"/>
+            </w:pPr>
+            <w:r>
+              <w:t xml:space="preserve">1620</w:t>
+            </w:r>
+          </w:p>
+        </w:tc>
+        <w:tc>
+          <w:tcPr/>
+          <w:p>
+            <w:pPr>
+              <w:pStyle w:val="Compact"/>
+              <w:jc w:val="left"/>
+            </w:pPr>
+            <w:r>
+              <w:t xml:space="preserve">87.2</w:t>
+            </w:r>
+          </w:p>
+        </w:tc>
+        <w:tc>
+          <w:tcPr/>
+          <w:p>
+            <w:pPr>
+              <w:pStyle w:val="Compact"/>
+              <w:jc w:val="left"/>
+            </w:pPr>
+            <w:r>
+              <w:t xml:space="preserve">98.3</w:t>
+            </w:r>
+          </w:p>
+        </w:tc>
+        <w:tc>
+          <w:tcPr/>
+          <w:p>
+            <w:pPr>
+              <w:pStyle w:val="Compact"/>
+              <w:jc w:val="left"/>
+            </w:pPr>
+            <w:r>
+              <w:t xml:space="preserve">91.4</w:t>
+            </w:r>
+          </w:p>
+        </w:tc>
+        <w:tc>
+          <w:tcPr/>
+          <w:p>
+            <w:pPr>
+              <w:pStyle w:val="Compact"/>
+              <w:jc w:val="left"/>
+            </w:pPr>
+            <w:r>
+              <w:t xml:space="preserve">9.9</w:t>
+            </w:r>
+          </w:p>
+        </w:tc>
+      </w:tr>
+      <w:tr>
+        <w:tc>
+          <w:tcPr/>
+          <w:p>
+            <w:pPr>
+              <w:pStyle w:val="Compact"/>
+              <w:jc w:val="left"/>
+            </w:pPr>
+            <w:r>
+              <w:t xml:space="preserve">ConvNeXt V2-Tiny</w:t>
+            </w:r>
+          </w:p>
+        </w:tc>
+        <w:tc>
+          <w:tcPr/>
+          <w:p>
+            <w:pPr>
+              <w:pStyle w:val="Compact"/>
+              <w:jc w:val="left"/>
+            </w:pPr>
+            <w:r>
+              <w:t xml:space="preserve">Leaf blight</w:t>
+            </w:r>
+          </w:p>
+        </w:tc>
+        <w:tc>
+          <w:tcPr/>
+          <w:p>
+            <w:pPr>
+              <w:pStyle w:val="Compact"/>
+              <w:jc w:val="left"/>
+            </w:pPr>
+            <w:r>
+              <w:t xml:space="preserve">1530</w:t>
+            </w:r>
+          </w:p>
+        </w:tc>
+        <w:tc>
+          <w:tcPr/>
+          <w:p>
+            <w:pPr>
+              <w:pStyle w:val="Compact"/>
+              <w:jc w:val="left"/>
+            </w:pPr>
+            <w:r>
+              <w:t xml:space="preserve">77.6</w:t>
+            </w:r>
+          </w:p>
+        </w:tc>
+        <w:tc>
+          <w:tcPr/>
+          <w:p>
+            <w:pPr>
+              <w:pStyle w:val="Compact"/>
+              <w:jc w:val="left"/>
+            </w:pPr>
+            <w:r>
+              <w:t xml:space="preserve">97.8</w:t>
+            </w:r>
+          </w:p>
+        </w:tc>
+        <w:tc>
+          <w:tcPr/>
+          <w:p>
+            <w:pPr>
+              <w:pStyle w:val="Compact"/>
+              <w:jc w:val="left"/>
+            </w:pPr>
+            <w:r>
+              <w:t xml:space="preserve">88.4</w:t>
+            </w:r>
+          </w:p>
+        </w:tc>
+        <w:tc>
+          <w:tcPr/>
+          <w:p>
+            <w:pPr>
+              <w:pStyle w:val="Compact"/>
+              <w:jc w:val="left"/>
+            </w:pPr>
+            <w:r>
+              <w:t xml:space="preserve">20.3</w:t>
+            </w:r>
+          </w:p>
+        </w:tc>
+      </w:tr>
+      <w:tr>
+        <w:tc>
+          <w:tcPr/>
+          <w:p>
+            <w:pPr>
+              <w:pStyle w:val="Compact"/>
+              <w:jc w:val="left"/>
+            </w:pPr>
+            <w:r>
+              <w:t xml:space="preserve">ConvNeXt V2-Tiny</w:t>
+            </w:r>
+          </w:p>
+        </w:tc>
+        <w:tc>
+          <w:tcPr/>
+          <w:p>
+            <w:pPr>
+              <w:pStyle w:val="Compact"/>
+              <w:jc w:val="left"/>
+            </w:pPr>
+            <w:r>
+              <w:t xml:space="preserve">Phomopsis leaf spot</w:t>
+            </w:r>
+          </w:p>
+        </w:tc>
+        <w:tc>
+          <w:tcPr/>
+          <w:p>
+            <w:pPr>
+              <w:pStyle w:val="Compact"/>
+              <w:jc w:val="left"/>
+            </w:pPr>
+            <w:r>
+              <w:t xml:space="preserve">940</w:t>
+            </w:r>
+          </w:p>
+        </w:tc>
+        <w:tc>
+          <w:tcPr/>
+          <w:p>
+            <w:pPr>
+              <w:pStyle w:val="Compact"/>
+              <w:jc w:val="left"/>
+            </w:pPr>
+            <w:r>
+              <w:t xml:space="preserve">58.4</w:t>
+            </w:r>
+          </w:p>
+        </w:tc>
+        <w:tc>
+          <w:tcPr/>
+          <w:p>
+            <w:pPr>
+              <w:pStyle w:val="Compact"/>
+              <w:jc w:val="left"/>
+            </w:pPr>
+            <w:r>
+              <w:t xml:space="preserve">89.0</w:t>
+            </w:r>
+          </w:p>
+        </w:tc>
+        <w:tc>
+          <w:tcPr/>
+          <w:p>
+            <w:pPr>
+              <w:pStyle w:val="Compact"/>
+              <w:jc w:val="left"/>
+            </w:pPr>
+            <w:r>
+              <w:t xml:space="preserve">81.4</w:t>
+            </w:r>
+          </w:p>
+        </w:tc>
+        <w:tc>
+          <w:tcPr/>
+          <w:p>
+            <w:pPr>
+              <w:pStyle w:val="Compact"/>
+              <w:jc w:val="left"/>
+            </w:pPr>
+            <w:r>
+              <w:t xml:space="preserve">38.3</w:t>
+            </w:r>
+          </w:p>
+        </w:tc>
+      </w:tr>
+      <w:tr>
+        <w:tc>
+          <w:tcPr/>
+          <w:p>
+            <w:pPr>
+              <w:pStyle w:val="Compact"/>
+              <w:jc w:val="left"/>
+            </w:pPr>
+            <w:r>
+              <w:t xml:space="preserve">ConvNeXt V2-Tiny</w:t>
+            </w:r>
+          </w:p>
+        </w:tc>
+        <w:tc>
+          <w:tcPr/>
+          <w:p>
+            <w:pPr>
+              <w:pStyle w:val="Compact"/>
+              <w:jc w:val="left"/>
+            </w:pPr>
+            <w:r>
+              <w:t xml:space="preserve">Root and collar rot</w:t>
+            </w:r>
+          </w:p>
+        </w:tc>
+        <w:tc>
+          <w:tcPr/>
+          <w:p>
+            <w:pPr>
+              <w:pStyle w:val="Compact"/>
+              <w:jc w:val="left"/>
+            </w:pPr>
+            <w:r>
+              <w:t xml:space="preserve">780</w:t>
+            </w:r>
+          </w:p>
+        </w:tc>
+        <w:tc>
+          <w:tcPr/>
+          <w:p>
+            <w:pPr>
+              <w:pStyle w:val="Compact"/>
+              <w:jc w:val="left"/>
+            </w:pPr>
+            <w:r>
+              <w:t xml:space="preserve">99.1</w:t>
+            </w:r>
+          </w:p>
+        </w:tc>
+        <w:tc>
+          <w:tcPr/>
+          <w:p>
+            <w:pPr>
+              <w:pStyle w:val="Compact"/>
+              <w:jc w:val="left"/>
+            </w:pPr>
+            <w:r>
+              <w:t xml:space="preserve">99.6</w:t>
+            </w:r>
+          </w:p>
+        </w:tc>
+        <w:tc>
+          <w:tcPr/>
+          <w:p>
+            <w:pPr>
+              <w:pStyle w:val="Compact"/>
+              <w:jc w:val="left"/>
+            </w:pPr>
+            <w:r>
+              <w:t xml:space="preserve">99.1</w:t>
+            </w:r>
+          </w:p>
+        </w:tc>
+        <w:tc>
+          <w:tcPr/>
+          <w:p>
+            <w:pPr>
+              <w:pStyle w:val="Compact"/>
+              <w:jc w:val="left"/>
+            </w:pPr>
+            <w:r>
+              <w:t xml:space="preserve">0.5</w:t>
+            </w:r>
+          </w:p>
+        </w:tc>
+      </w:tr>
+      <w:tr>
+        <w:tc>
+          <w:tcPr/>
+          <w:p>
+            <w:pPr>
+              <w:pStyle w:val="Compact"/>
+              <w:jc w:val="left"/>
+            </w:pPr>
+            <w:r>
+              <w:t xml:space="preserve">ViT-S/16</w:t>
+            </w:r>
+          </w:p>
+        </w:tc>
+        <w:tc>
+          <w:tcPr/>
+          <w:p>
+            <w:pPr>
+              <w:pStyle w:val="Compact"/>
+              <w:jc w:val="left"/>
+            </w:pPr>
+            <w:r>
+              <w:t xml:space="preserve">Algal leaf spot</w:t>
+            </w:r>
+          </w:p>
+        </w:tc>
+        <w:tc>
+          <w:tcPr/>
+          <w:p>
+            <w:pPr>
+              <w:pStyle w:val="Compact"/>
+              <w:jc w:val="left"/>
+            </w:pPr>
+            <w:r>
+              <w:t xml:space="preserve">1620</w:t>
+            </w:r>
+          </w:p>
+        </w:tc>
+        <w:tc>
+          <w:tcPr/>
+          <w:p>
+            <w:pPr>
+              <w:pStyle w:val="Compact"/>
+              <w:jc w:val="left"/>
+            </w:pPr>
+            <w:r>
+              <w:t xml:space="preserve">81.9</w:t>
+            </w:r>
+          </w:p>
+        </w:tc>
+        <w:tc>
+          <w:tcPr/>
+          <w:p>
+            <w:pPr>
+              <w:pStyle w:val="Compact"/>
+              <w:jc w:val="left"/>
+            </w:pPr>
+            <w:r>
+              <w:t xml:space="preserve">97.2</w:t>
+            </w:r>
+          </w:p>
+        </w:tc>
+        <w:tc>
+          <w:tcPr/>
+          <w:p>
+            <w:pPr>
+              <w:pStyle w:val="Compact"/>
+              <w:jc w:val="left"/>
+            </w:pPr>
+            <w:r>
+              <w:t xml:space="preserve">89.1</w:t>
+            </w:r>
+          </w:p>
+        </w:tc>
+        <w:tc>
+          <w:tcPr/>
+          <w:p>
+            <w:pPr>
+              <w:pStyle w:val="Compact"/>
+              <w:jc w:val="left"/>
+            </w:pPr>
+            <w:r>
+              <w:t xml:space="preserve">14.3</w:t>
+            </w:r>
+          </w:p>
+        </w:tc>
+      </w:tr>
+      <w:tr>
+        <w:tc>
+          <w:tcPr/>
+          <w:p>
+            <w:pPr>
+              <w:pStyle w:val="Compact"/>
+              <w:jc w:val="left"/>
+            </w:pPr>
+            <w:r>
+              <w:t xml:space="preserve">ViT-S/16</w:t>
+            </w:r>
+          </w:p>
+        </w:tc>
+        <w:tc>
+          <w:tcPr/>
+          <w:p>
+            <w:pPr>
+              <w:pStyle w:val="Compact"/>
+              <w:jc w:val="left"/>
+            </w:pPr>
+            <w:r>
+              <w:t xml:space="preserve">Leaf blight</w:t>
+            </w:r>
+          </w:p>
+        </w:tc>
+        <w:tc>
+          <w:tcPr/>
+          <w:p>
+            <w:pPr>
+              <w:pStyle w:val="Compact"/>
+              <w:jc w:val="left"/>
+            </w:pPr>
+            <w:r>
+              <w:t xml:space="preserve">1530</w:t>
+            </w:r>
+          </w:p>
+        </w:tc>
+        <w:tc>
+          <w:tcPr/>
+          <w:p>
+            <w:pPr>
+              <w:pStyle w:val="Compact"/>
+              <w:jc w:val="left"/>
+            </w:pPr>
+            <w:r>
+              <w:t xml:space="preserve">76.4</w:t>
+            </w:r>
+          </w:p>
+        </w:tc>
+        <w:tc>
+          <w:tcPr/>
+          <w:p>
+            <w:pPr>
+              <w:pStyle w:val="Compact"/>
+              <w:jc w:val="left"/>
+            </w:pPr>
+            <w:r>
+              <w:t xml:space="preserve">96.3</w:t>
+            </w:r>
+          </w:p>
+        </w:tc>
+        <w:tc>
+          <w:tcPr/>
+          <w:p>
+            <w:pPr>
+              <w:pStyle w:val="Compact"/>
+              <w:jc w:val="left"/>
+            </w:pPr>
+            <w:r>
+              <w:t xml:space="preserve">85.4</w:t>
+            </w:r>
+          </w:p>
+        </w:tc>
+        <w:tc>
+          <w:tcPr/>
+          <w:p>
+            <w:pPr>
+              <w:pStyle w:val="Compact"/>
+              <w:jc w:val="left"/>
+            </w:pPr>
+            <w:r>
+              <w:t xml:space="preserve">20.5</w:t>
+            </w:r>
+          </w:p>
+        </w:tc>
+      </w:tr>
+      <w:tr>
+        <w:tc>
+          <w:tcPr/>
+          <w:p>
+            <w:pPr>
+              <w:pStyle w:val="Compact"/>
+              <w:jc w:val="left"/>
+            </w:pPr>
+            <w:r>
+              <w:t xml:space="preserve">ViT-S/16</w:t>
+            </w:r>
+          </w:p>
+        </w:tc>
+        <w:tc>
+          <w:tcPr/>
+          <w:p>
+            <w:pPr>
+              <w:pStyle w:val="Compact"/>
+              <w:jc w:val="left"/>
+            </w:pPr>
+            <w:r>
+              <w:t xml:space="preserve">Phomopsis leaf spot</w:t>
+            </w:r>
+          </w:p>
+        </w:tc>
+        <w:tc>
+          <w:tcPr/>
+          <w:p>
+            <w:pPr>
+              <w:pStyle w:val="Compact"/>
+              <w:jc w:val="left"/>
+            </w:pPr>
+            <w:r>
+              <w:t xml:space="preserve">940</w:t>
+            </w:r>
+          </w:p>
+        </w:tc>
+        <w:tc>
+          <w:tcPr/>
+          <w:p>
+            <w:pPr>
+              <w:pStyle w:val="Compact"/>
+              <w:jc w:val="left"/>
+            </w:pPr>
+            <w:r>
+              <w:t xml:space="preserve">71.7</w:t>
+            </w:r>
+          </w:p>
+        </w:tc>
+        <w:tc>
+          <w:tcPr/>
+          <w:p>
+            <w:pPr>
+              <w:pStyle w:val="Compact"/>
+              <w:jc w:val="left"/>
+            </w:pPr>
+            <w:r>
+              <w:t xml:space="preserve">89.3</w:t>
+            </w:r>
+          </w:p>
+        </w:tc>
+        <w:tc>
+          <w:tcPr/>
+          <w:p>
+            <w:pPr>
+              <w:pStyle w:val="Compact"/>
+              <w:jc w:val="left"/>
+            </w:pPr>
+            <w:r>
+              <w:t xml:space="preserve">80.9</w:t>
+            </w:r>
+          </w:p>
+        </w:tc>
+        <w:tc>
+          <w:tcPr/>
+          <w:p>
+            <w:pPr>
+              <w:pStyle w:val="Compact"/>
+              <w:jc w:val="left"/>
+            </w:pPr>
+            <w:r>
+              <w:t xml:space="preserve">24.3</w:t>
+            </w:r>
+          </w:p>
+        </w:tc>
+      </w:tr>
+      <w:tr>
+        <w:tc>
+          <w:tcPr/>
+          <w:p>
+            <w:pPr>
+              <w:pStyle w:val="Compact"/>
+              <w:jc w:val="left"/>
+            </w:pPr>
+            <w:r>
+              <w:t xml:space="preserve">ViT-S/16</w:t>
+            </w:r>
+          </w:p>
+        </w:tc>
+        <w:tc>
+          <w:tcPr/>
+          <w:p>
+            <w:pPr>
+              <w:pStyle w:val="Compact"/>
+              <w:jc w:val="left"/>
+            </w:pPr>
+            <w:r>
+              <w:t xml:space="preserve">Root and collar rot</w:t>
+            </w:r>
+          </w:p>
+        </w:tc>
+        <w:tc>
+          <w:tcPr/>
+          <w:p>
+            <w:pPr>
+              <w:pStyle w:val="Compact"/>
+              <w:jc w:val="left"/>
+            </w:pPr>
+            <w:r>
+              <w:t xml:space="preserve">780</w:t>
+            </w:r>
+          </w:p>
+        </w:tc>
+        <w:tc>
+          <w:tcPr/>
+          <w:p>
+            <w:pPr>
+              <w:pStyle w:val="Compact"/>
+              <w:jc w:val="left"/>
+            </w:pPr>
+            <w:r>
+              <w:t xml:space="preserve">100.0</w:t>
+            </w:r>
+          </w:p>
+        </w:tc>
+        <w:tc>
+          <w:tcPr/>
+          <w:p>
+            <w:pPr>
+              <w:pStyle w:val="Compact"/>
+              <w:jc w:val="left"/>
+            </w:pPr>
+            <w:r>
+              <w:t xml:space="preserve">100.0</w:t>
+            </w:r>
+          </w:p>
+        </w:tc>
+        <w:tc>
+          <w:tcPr/>
+          <w:p>
+            <w:pPr>
+              <w:pStyle w:val="Compact"/>
+              <w:jc w:val="left"/>
+            </w:pPr>
+            <w:r>
+              <w:t xml:space="preserve">99.9</w:t>
+            </w:r>
+          </w:p>
+        </w:tc>
+        <w:tc>
+          <w:tcPr/>
+          <w:p>
+            <w:pPr>
+              <w:pStyle w:val="Compact"/>
+              <w:jc w:val="left"/>
+            </w:pPr>
+            <w:r>
+              <w:t xml:space="preserve">0.0</w:t>
+            </w:r>
+          </w:p>
+        </w:tc>
+      </w:tr>
+    </w:tbl>
+    <w:bookmarkEnd w:id="46"/>
     <w:sectPr/>
   </w:body>
 </w:document>

</xml_diff>